<commit_message>
Add reproducible three-panel model accuracy figure, all-model predictions CSV, Google Doc integration scripts, and updated visualization notebook
</commit_message>
<xml_diff>
--- a/reports/final/SIADS_696_Team_7_Final_Report_FINAL_Rubric_Comments.docx
+++ b/reports/final/SIADS_696_Team_7_Final_Report_FINAL_Rubric_Comments.docx
@@ -16500,11 +16500,7 @@
         <w:rPr/>
       </w:pPr>
       <w:r>
-        <w:rPr>
-          <w:color w:val="000000"/>
-          <w:sz w:val="22"/>
-        </w:rPr>
-        <w:t>the unsupervised analysis used two methods with different clustering assumptions. DBSCAN was chosen because it is density-based and can label noise/outlier counties, which is useful when some counties may have unusual socio-environmental profiles. K-Means was chosen as a contrasting centroid-based method because it assigns every county to a cluster and provides a cleaner partition for comparison. Both methods used standardized non-FMD features so variables measured on different scales would contribute comparably. FMD was held out and compared only after clusters were formed, while PCA was used for visualization and cluster-search diagnostics.</w:t>
+        <w:t>Our unsupervised analysis asked whether counties fall into distinct socio-environmental clusters. FMD was intentionally excluded from clustering so that DBSCAN and K-Means discovered structure using only environmental, climate, socioeconomic, healthcare access, education, and industry characteristics. We then examined FMD after clustering as a held-out descriptive outcome. This design prevents the cluster labels from simply reproducing the mental-health target and makes any FMD differences across clusters an external comparison rather than a clustering input.</w:t>
       </w:r>
     </w:p>
     <w:p>
@@ -18059,11 +18055,7 @@
         <w:rPr/>
       </w:pPr>
       <w:r>
-        <w:rPr>
-          <w:color w:val="000000"/>
-          <w:sz w:val="22"/>
-        </w:rPr>
-        <w:t>In order to address the curse of dimensionality prior to clustering, the data were normalized using standard scaling and visualized on a two-dimensional PCA embedding. The final clustering feature matrix used numerical county profile variables only, which allowed us to compare density-based and centroid-based clustering without including the FMD outcome.</w:t>
+        <w:t>Before clustering, numeric county-profile features were harmonized and standardized with StandardScaler so variables measured on different scales contributed comparably. The final reproducible report pipeline used PCA for the two-dimensional diagnostic embedding and cluster visualizations; earlier exploratory notebooks tested UMAP/PCA options, but the report figures and sensitivity table are generated from the PCA-based pipeline for reproducibility.</w:t>
       </w:r>
     </w:p>
     <w:p>
@@ -18080,11 +18072,7 @@
         <w:rPr/>
       </w:pPr>
       <w:r>
-        <w:rPr>
-          <w:color w:val="000000"/>
-          <w:sz w:val="22"/>
-        </w:rPr>
-        <w:t>For our unsupervised section, we clustered counties using environmental, climate, socioeconomic, healthcare access, education, and industry features. We first harmonized and standardized the features, then used PCA for visualization. DBSCAN was tuned across epsilon and minimum-sample values, while K-Means was searched across candidate k values. We selected settings using silhouette scores, cluster counts, noise percentage for DBSCAN, and interpretability. Because FMD was excluded from clustering, differences in FMD across clusters are post-hoc outcome comparisons rather than clustering inputs.</w:t>
+        <w:t>DBSCAN and K-Means were selected as complementary methods. DBSCAN was selected because it does not require pre-specifying the number of clusters and can identify outlier counties as noise. K-Means was used as a centroid-based comparison because it assigns every county to exactly one cluster, making it useful for interpretable county archetypes. In the final reproducible pipeline, DBSCAN searched exactly 70 parameter combinations: 14 eps values from np.round(np.linspace(0.15, 2.0, 14), 2) multiplied by five min_samples values {5, 10, 20, 35, 50}. The selected DBSCAN setting was eps = 1.43 and min_samples = 5. K-Means evaluated k in {2, 3, 4, 5, 6} and selected k = 2, which had the highest silhouette score (0.89 on the PCA embedding; 0.75 on the scaled feature matrix). The full unsupervised search output therefore contains 75 rows: 70 DBSCAN settings plus 5 K-Means settings.</w:t>
       </w:r>
     </w:p>
     <w:p>
@@ -18100,49 +18088,43 @@
         <w:rPr/>
       </w:pPr>
       <w:r>
-        <w:rPr>
-          <w:color w:val="000000"/>
-          <w:sz w:val="22"/>
-        </w:rPr>
-        <w:drawing>
-          <wp:inline distB="114300" distT="114300" distL="114300" distR="114300">
-            <wp:extent cx="5943600" cy="3340100"/>
-            <wp:effectExtent b="0" l="0" r="0" t="0"/>
-            <wp:docPr id="10" name="image10.png"/>
-            <a:graphic>
-              <a:graphicData uri="http://schemas.openxmlformats.org/drawingml/2006/picture">
-                <pic:pic>
-                  <pic:nvPicPr>
-                    <pic:cNvPr id="0" name="image10.png"/>
-                    <pic:cNvPicPr preferRelativeResize="0"/>
-                  </pic:nvPicPr>
-                  <pic:blipFill>
-                    <a:blip r:embed="rId20"/>
-                    <a:srcRect b="0" l="0" r="0" t="0"/>
-                    <a:stretch>
-                      <a:fillRect/>
-                    </a:stretch>
-                  </pic:blipFill>
-                  <pic:spPr>
-                    <a:xfrm>
-                      <a:off x="0" y="0"/>
-                      <a:ext cx="5943600" cy="3340100"/>
-                    </a:xfrm>
-                    <a:prstGeom prst="rect"/>
-                    <a:ln/>
-                  </pic:spPr>
-                </pic:pic>
-              </a:graphicData>
-            </a:graphic>
-          </wp:inline>
-        </w:drawing>
-      </w:r>
-      <w:r>
-        <w:rPr>
-          <w:color w:val="000000"/>
-          <w:sz w:val="22"/>
-          <w:rtl w:val="0"/>
-        </w:rPr>
+        <w:t xml:space="preserve">Reproducibility references: the DBSCAN/K-Means search is implemented in </w:t>
+      </w:r>
+      <w:hyperlink r:id="rId2">
+        <w:r>
+          <w:rPr>
+            <w:color w:val="0563C1"/>
+            <w:u w:val="single"/>
+          </w:rPr>
+          <w:t>scripts/03_modeling/generate_rubric_analyses.py</w:t>
+        </w:r>
+      </w:hyperlink>
+      <w:r>
+        <w:t xml:space="preserve"> (DBSCAN lines 309-345; K-Means lines 346-365); the generated search results are saved in </w:t>
+      </w:r>
+      <w:hyperlink r:id="rId34">
+        <w:r>
+          <w:rPr>
+            <w:color w:val="0563C1"/>
+            <w:u w:val="single"/>
+          </w:rPr>
+          <w:t>outputs/modeling/rubric_completion/unsupervised_method_search.csv</w:t>
+        </w:r>
+      </w:hyperlink>
+      <w:r>
+        <w:t xml:space="preserve">; and Figure 11 is generated in </w:t>
+      </w:r>
+      <w:hyperlink r:id="rId35">
+        <w:r>
+          <w:rPr>
+            <w:color w:val="0563C1"/>
+            <w:u w:val="single"/>
+          </w:rPr>
+          <w:t>scripts/04_reporting_visualizations/create_reproducible_visualizations_notebook.py</w:t>
+        </w:r>
+      </w:hyperlink>
+      <w:r>
+        <w:t>.</w:t>
       </w:r>
     </w:p>
     <w:p>
@@ -20030,11 +20012,7 @@
         <w:jc w:val="center"/>
       </w:pPr>
       <w:r>
-        <w:rPr>
-          <w:color w:val="000000"/>
-          <w:sz w:val="22"/>
-        </w:rPr>
-        <w:t>Figure 11. DBSCAN and K-Means unsupervised sensitivity search. K-Means k=2 had the strongest silhouette score, while DBSCAN was highly sensitive to eps and min_samples.</w:t>
+        <w:t>Figure 11. DBSCAN and K-Means unsupervised sensitivity search across 75 total settings: 70 DBSCAN eps/min_samples configurations and 5 K-Means k values. K-Means k=2 had the strongest silhouette score, while DBSCAN was highly sensitive to eps and min_samples.</w:t>
       </w:r>
     </w:p>
     <w:p>

</xml_diff>